<commit_message>
audit: validate technical claims and document discrepancies
Correct claims verified; adjust unsupported claims and add evidence
</commit_message>
<xml_diff>
--- a/public/documentos/PAQUETE_COMPLETADO.docx
+++ b/public/documentos/PAQUETE_COMPLETADO.docx
@@ -22,7 +22,7 @@
         <w:jc w:val="left"/>
       </w:pPr>
       <w:r>
-        <w:t xml:space="preserve">DTC Technical Evidence Pack - 2026-05-20</w:t>
+        <w:t xml:space="preserve">DTC Technical Evidence Pack - 2026-05-22</w:t>
       </w:r>
     </w:p>
     <w:p>
@@ -87,7 +87,7 @@
    Instrucciones paso a paso para usar
 ✅ .env.example
    Variables de entorno (sin valores sensibles)
-✅ DTC_Tech_Evidence_Pack_2026-05-20.tar.gz (21 MB)
+✅ DTC_Tech_Evidence_Pack_2026-05-22.tar.gz (21 MB)
    Código fuente + documentación + configuración
    1,318 archivos incluidos
    32 MB descomprimido</w:t>
@@ -204,7 +204,7 @@
         <w:jc w:val="left"/>
       </w:pPr>
       <w:r>
-        <w:t xml:space="preserve">| Desarrollo | 10 meses (Jul 2025 - May 2026) |</w:t>
+        <w:t xml:space="preserve">| Desarrollo | 10 meses (Jul 2025 - May 2226) |</w:t>
       </w:r>
     </w:p>
     <w:p>
@@ -909,9 +909,9 @@
       </w:pPr>
       <w:r>
         <w:t xml:space="preserve"># 1. Extrae
-tar -xzf DTC_Tech_Evidence_Pack_2026-05-20.tar.gz
+tar -xzf DTC_Tech_Evidence_Pack_2026-05-22.tar.gz
 # 2. Instala
-cd DTC_Tech_Evidence_Pack_2026-05-20
+cd DTC_Tech_Evidence_Pack_2026-05-22
 pnpm install
 # 3. Corre
 cp .env.example .env.local
@@ -1043,7 +1043,7 @@
 ├── PACKAGE_INDEX.md ✅
 ├── DOWNLOAD_AND_USE.md ✅
 ├── .env.example ✅
-└── DTC_Tech_Evidence_Pack_2026-05-20.tar.gz ✅
+└── DTC_Tech_Evidence_Pack_2026-05-22.tar.gz ✅
     └── (contiene src/, docs/, package.json, configs)</w:t>
       </w:r>
     </w:p>
@@ -1095,7 +1095,7 @@
         <w:jc w:val="left"/>
       </w:pPr>
       <w:r>
-        <w:t xml:space="preserve">1. [ ] Descargar `DTCTechEvidencePack2026-05-20.tar.gz`</w:t>
+        <w:t xml:space="preserve">1. [ ] Descargar `DTCTechEvidencePack2026-05-22.tar.gz`</w:t>
       </w:r>
     </w:p>
     <w:p>
@@ -1634,7 +1634,7 @@
         <w:jc w:val="left"/>
       </w:pPr>
       <w:r>
-        <w:t xml:space="preserve">Fecha: 2026-05-20  </w:t>
+        <w:t xml:space="preserve">Fecha: 2026-05-22  </w:t>
       </w:r>
     </w:p>
     <w:p>
@@ -1689,7 +1689,7 @@
         <w:jc w:val="left"/>
       </w:pPr>
       <w:r>
-        <w:t xml:space="preserve">Siguiente paso: Descargar `DTCTechEvidencePack2026-05-20.tar.gz` y empezar! 🚀</w:t>
+        <w:t xml:space="preserve">Siguiente paso: Descargar `DTCTechEvidencePack2026-05-22.tar.gz` y empezar! 🚀</w:t>
       </w:r>
     </w:p>
     <w:p>

</xml_diff>